<commit_message>
Ficha: nota exclusion closets/roperos no incluidos
</commit_message>
<xml_diff>
--- a/TPL_Ficha_Tecnica.docx
+++ b/TPL_Ficha_Tecnica.docx
@@ -1118,6 +1118,27 @@
     </w:p>
     <w:p>
       <w:pPr>
+        <w:spacing w:before="240" w:after="60"/>
+        <w:jc w:val="both"/>
+      </w:pPr>
+      <w:r>
+        <w:rPr>
+          <w:b/>
+          <w:sz w:val="16"/>
+          <w:color w:val="C00000"/>
+        </w:rPr>
+        <w:t xml:space="preserve">Importante: los clósets y roperos NO están incluidos en la entrega de ninguna unidad. </w:t>
+      </w:r>
+      <w:r>
+        <w:rPr>
+          <w:sz w:val="16"/>
+          <w:color w:val="666666"/>
+        </w:rPr>
+        <w:t>Todo elemento, mobiliario o acabado no descrito expresamente en la presente ficha y en el Catálogo de Acabados Garantizados de VIVA PRO no forma parte de la entrega (p. ej. clósets, roperos, muebles de dormitorio, cortinas y similares).</w:t>
+      </w:r>
+    </w:p>
+    <w:p>
+      <w:pPr>
         <w:spacing w:before="320" w:after="120"/>
         <w:jc w:val="both"/>
       </w:pPr>

</xml_diff>

<commit_message>
Actualización arquitectura Jul-2026: precios, renders, fichas dinámicas, UI y correcciones del generador
</commit_message>
<xml_diff>
--- a/TPL_Ficha_Tecnica.docx
+++ b/TPL_Ficha_Tecnica.docx
@@ -942,6 +942,118 @@
           </w:p>
         </w:tc>
       </w:tr>
+      <w:tr>
+        <w:tc>
+          <w:tcPr>
+            <w:tcW w:w="2200" w:type="dxa"/>
+            <w:shd w:val="clear" w:color="auto" w:fill="F2F2F2"/>
+          </w:tcPr>
+          <w:p>
+            <w:r>
+              <w:rPr>
+                <w:b/>
+                <w:sz w:val="17"/>
+              </w:rPr>
+              <w:t>Terraza (azotea)</w:t>
+            </w:r>
+          </w:p>
+        </w:tc>
+        <w:tc>
+          <w:tcPr>
+            <w:tcW w:w="2400" w:type="dxa"/>
+          </w:tcPr>
+          <w:p>
+            <w:r>
+              <w:rPr>
+                <w:sz w:val="17"/>
+              </w:rPr>
+              <w:t>Cerámico.</w:t>
+            </w:r>
+          </w:p>
+        </w:tc>
+        <w:tc>
+          <w:tcPr>
+            <w:tcW w:w="2400" w:type="dxa"/>
+          </w:tcPr>
+          <w:p>
+            <w:r>
+              <w:rPr>
+                <w:sz w:val="17"/>
+              </w:rPr>
+              <w:t>Perímetro con paredes pintadas; entrega no techada.</w:t>
+            </w:r>
+          </w:p>
+        </w:tc>
+        <w:tc>
+          <w:tcPr>
+            <w:tcW w:w="2072" w:type="dxa"/>
+          </w:tcPr>
+          <w:p>
+            <w:r>
+              <w:rPr>
+                <w:sz w:val="17"/>
+              </w:rPr>
+              <w:t>—</w:t>
+            </w:r>
+          </w:p>
+        </w:tc>
+      </w:tr>
+      <w:tr>
+        <w:tc>
+          <w:tcPr>
+            <w:tcW w:w="2200" w:type="dxa"/>
+            <w:shd w:val="clear" w:color="auto" w:fill="F2F2F2"/>
+          </w:tcPr>
+          <w:p>
+            <w:r>
+              <w:rPr>
+                <w:b/>
+                <w:sz w:val="17"/>
+              </w:rPr>
+              <w:t>Estacionamiento</w:t>
+            </w:r>
+          </w:p>
+        </w:tc>
+        <w:tc>
+          <w:tcPr>
+            <w:tcW w:w="2400" w:type="dxa"/>
+          </w:tcPr>
+          <w:p>
+            <w:r>
+              <w:rPr>
+                <w:sz w:val="17"/>
+              </w:rPr>
+              <w:t>Cemento pulido.</w:t>
+            </w:r>
+          </w:p>
+        </w:tc>
+        <w:tc>
+          <w:tcPr>
+            <w:tcW w:w="2400" w:type="dxa"/>
+          </w:tcPr>
+          <w:p>
+            <w:r>
+              <w:rPr>
+                <w:sz w:val="17"/>
+              </w:rPr>
+              <w:t>Empastado y pintura.</w:t>
+            </w:r>
+          </w:p>
+        </w:tc>
+        <w:tc>
+          <w:tcPr>
+            <w:tcW w:w="2072" w:type="dxa"/>
+          </w:tcPr>
+          <w:p>
+            <w:r>
+              <w:rPr>
+                <w:sz w:val="17"/>
+              </w:rPr>
+              <w:t>Reja corrediza de apertura manual (no automática).</w:t>
+            </w:r>
+          </w:p>
+        </w:tc>
+      </w:tr>
     </w:tbl>
     <w:p>
       <w:pPr>
@@ -1101,7 +1213,7 @@
         <w:rPr>
           <w:sz w:val="18"/>
         </w:rPr>
-        <w:t xml:space="preserve">•  Luces de emergencia en cochera, escalera, ingreso y hall de escalera; luminarias tipo LED.</w:t>
+        <w:t xml:space="preserve">•  Luces de emergencia en estacionamiento, escalera, ingreso y hall de escalera; luminarias tipo LED.</w:t>
       </w:r>
     </w:p>
     <w:p>
@@ -1113,7 +1225,7 @@
         <w:rPr>
           <w:sz w:val="18"/>
         </w:rPr>
-        <w:t xml:space="preserve">•  Cochera con piso de cemento pulido (no incluida en la presente unidad).</w:t>
+        <w:t xml:space="preserve">•  Estacionamiento con piso de cemento pulido (no incluido en la presente unidad).</w:t>
       </w:r>
     </w:p>
     <w:p>

</xml_diff>

<commit_message>
Ficha técnica: área de terraza explícita (no techada) + acabados en hoja aparte
</commit_message>
<xml_diff>
--- a/TPL_Ficha_Tecnica.docx
+++ b/TPL_Ficha_Tecnica.docx
@@ -240,6 +240,36 @@
                 <w:b/>
                 <w:sz w:val="18"/>
               </w:rPr>
+              <w:t>Área de terraza (no techada)</w:t>
+            </w:r>
+          </w:p>
+        </w:tc>
+        <w:tc>
+          <w:tcPr>
+            <w:tcW w:w="6272" w:type="dxa"/>
+          </w:tcPr>
+          <w:p>
+            <w:r>
+              <w:rPr>
+                <w:sz w:val="18"/>
+              </w:rPr>
+              <w:t>XX m² (área no techada).</w:t>
+            </w:r>
+          </w:p>
+        </w:tc>
+      </w:tr>
+      <w:tr>
+        <w:tc>
+          <w:tcPr>
+            <w:tcW w:w="2800" w:type="dxa"/>
+            <w:shd w:val="clear" w:color="auto" w:fill="F2F2F2"/>
+          </w:tcPr>
+          <w:p>
+            <w:r>
+              <w:rPr>
+                <w:b/>
+                <w:sz w:val="18"/>
+              </w:rPr>
               <w:t>Distribución</w:t>
             </w:r>
           </w:p>
@@ -388,6 +418,7 @@
     </w:p>
     <w:p>
       <w:pPr>
+        <w:pageBreakBefore/>
         <w:spacing w:before="320" w:after="120"/>
       </w:pPr>
       <w:r>

</xml_diff>